<commit_message>
Ajout des docs de francais
</commit_message>
<xml_diff>
--- a/Stage/s2/RapportHebdomadaire.docx
+++ b/Stage/s2/RapportHebdomadaire.docx
@@ -163,8 +163,16 @@
               <w:rPr>
                 <w:b/>
               </w:rPr>
-              <w:t>Christopher-WilliamArchambault</w:t>
-            </w:r>
+              <w:t>Christopher-</w:t>
+            </w:r>
+            <w:proofErr w:type="spellStart"/>
+            <w:r>
+              <w:rPr>
+                <w:b/>
+              </w:rPr>
+              <w:t>WilliamArchambault</w:t>
+            </w:r>
+            <w:proofErr w:type="spellEnd"/>
             <w:r>
               <w:rPr>
                 <w:b/>
@@ -206,7 +214,19 @@
               <w:rPr>
                 <w:b/>
               </w:rPr>
-              <w:t>1/22/2024</w:t>
+              <w:t>1/2</w:t>
+            </w:r>
+            <w:r>
+              <w:rPr>
+                <w:b/>
+              </w:rPr>
+              <w:t>9</w:t>
+            </w:r>
+            <w:r>
+              <w:rPr>
+                <w:b/>
+              </w:rPr>
+              <w:t>/2024</w:t>
             </w:r>
             <w:r>
               <w:rPr>
@@ -224,7 +244,25 @@
               <w:rPr>
                 <w:b/>
               </w:rPr>
-              <w:t>1/26/2024</w:t>
+              <w:t>02</w:t>
+            </w:r>
+            <w:r>
+              <w:rPr>
+                <w:b/>
+              </w:rPr>
+              <w:t>/</w:t>
+            </w:r>
+            <w:r>
+              <w:rPr>
+                <w:b/>
+              </w:rPr>
+              <w:t>02</w:t>
+            </w:r>
+            <w:r>
+              <w:rPr>
+                <w:b/>
+              </w:rPr>
+              <w:t>/2024</w:t>
             </w:r>
           </w:p>
           <w:p>
@@ -256,12 +294,14 @@
               </w:rPr>
               <w:t xml:space="preserve"> : </w:t>
             </w:r>
+            <w:proofErr w:type="spellStart"/>
             <w:r>
               <w:rPr>
                 <w:b/>
               </w:rPr>
               <w:t>CyFrame</w:t>
             </w:r>
+            <w:proofErr w:type="spellEnd"/>
             <w:r>
               <w:rPr>
                 <w:b/>
@@ -286,18 +326,28 @@
               </w:rPr>
               <w:t xml:space="preserve"> </w:t>
             </w:r>
+            <w:proofErr w:type="spellStart"/>
             <w:r>
               <w:rPr>
                 <w:b/>
               </w:rPr>
               <w:t>Andriy</w:t>
             </w:r>
-            <w:r>
-              <w:rPr>
-                <w:b/>
-              </w:rPr>
-              <w:t xml:space="preserve"> Malynivskyy</w:t>
-            </w:r>
+            <w:proofErr w:type="spellEnd"/>
+            <w:r>
+              <w:rPr>
+                <w:b/>
+              </w:rPr>
+              <w:t xml:space="preserve"> </w:t>
+            </w:r>
+            <w:proofErr w:type="spellStart"/>
+            <w:r>
+              <w:rPr>
+                <w:b/>
+              </w:rPr>
+              <w:t>Malynivskyy</w:t>
+            </w:r>
+            <w:proofErr w:type="spellEnd"/>
           </w:p>
         </w:tc>
       </w:tr>
@@ -489,7 +539,7 @@
       </w:tr>
       <w:tr>
         <w:trPr>
-          <w:trHeight w:hRule="exact" w:val="3320"/>
+          <w:trHeight w:hRule="exact" w:val="1187"/>
           <w:jc w:val="center"/>
         </w:trPr>
         <w:tc>
@@ -514,49 +564,23 @@
                 <w:rFonts w:ascii="Arial" w:hAnsi="Arial"/>
                 <w:highlight w:val="yellow"/>
               </w:rPr>
-              <w:t>Journée</w:t>
-            </w:r>
-            <w:r>
-              <w:rPr>
-                <w:rFonts w:ascii="Arial" w:hAnsi="Arial"/>
-                <w:highlight w:val="yellow"/>
-              </w:rPr>
-              <w:t xml:space="preserve"> formative. </w:t>
-            </w:r>
-            <w:r>
-              <w:rPr>
-                <w:rFonts w:ascii="Arial" w:hAnsi="Arial"/>
-                <w:highlight w:val="yellow"/>
-              </w:rPr>
-              <w:t>Création</w:t>
-            </w:r>
-            <w:r>
-              <w:rPr>
-                <w:rFonts w:ascii="Arial" w:hAnsi="Arial"/>
-                <w:highlight w:val="yellow"/>
-              </w:rPr>
-              <w:t xml:space="preserve"> d’un cluster de l’application pour la modifier et jouer avec. </w:t>
-            </w:r>
-            <w:r>
-              <w:rPr>
-                <w:rFonts w:ascii="Arial" w:hAnsi="Arial"/>
-                <w:highlight w:val="yellow"/>
-              </w:rPr>
-              <w:t>Découverte</w:t>
-            </w:r>
-            <w:r>
-              <w:rPr>
-                <w:rFonts w:ascii="Arial" w:hAnsi="Arial"/>
-                <w:highlight w:val="yellow"/>
-              </w:rPr>
-              <w:t xml:space="preserve"> de l’application de toute les </w:t>
-            </w:r>
-            <w:r>
-              <w:rPr>
-                <w:rFonts w:ascii="Arial" w:hAnsi="Arial"/>
-                <w:highlight w:val="yellow"/>
-              </w:rPr>
-              <w:t>façons</w:t>
+              <w:t xml:space="preserve">Ajout du </w:t>
+            </w:r>
+            <w:proofErr w:type="spellStart"/>
+            <w:r>
+              <w:rPr>
+                <w:rFonts w:ascii="Arial" w:hAnsi="Arial"/>
+                <w:highlight w:val="yellow"/>
+              </w:rPr>
+              <w:t>darkmode</w:t>
+            </w:r>
+            <w:proofErr w:type="spellEnd"/>
+            <w:r>
+              <w:rPr>
+                <w:rFonts w:ascii="Arial" w:hAnsi="Arial"/>
+                <w:highlight w:val="yellow"/>
+              </w:rPr>
+              <w:t xml:space="preserve"> sur la page (settings)</w:t>
             </w:r>
           </w:p>
         </w:tc>
@@ -582,14 +606,7 @@
                 <w:rFonts w:ascii="Arial" w:hAnsi="Arial"/>
                 <w:highlight w:val="yellow"/>
               </w:rPr>
-              <w:t xml:space="preserve">Découvrir ce qu’est ASP </w:t>
-            </w:r>
-            <w:r>
-              <w:rPr>
-                <w:rFonts w:ascii="Arial" w:hAnsi="Arial"/>
-                <w:highlight w:val="yellow"/>
-              </w:rPr>
-              <w:t>Classique</w:t>
+              <w:t>Que certaine fonction que j’utilisais n’est pas compatible sur IE 8</w:t>
             </w:r>
           </w:p>
         </w:tc>
@@ -615,42 +632,7 @@
                 <w:rFonts w:ascii="Arial" w:hAnsi="Arial"/>
                 <w:highlight w:val="yellow"/>
               </w:rPr>
-              <w:t xml:space="preserve">Comprendre comment </w:t>
-            </w:r>
-            <w:r>
-              <w:rPr>
-                <w:rFonts w:ascii="Arial" w:hAnsi="Arial"/>
-                <w:highlight w:val="yellow"/>
-              </w:rPr>
-              <w:t xml:space="preserve">fonctionne </w:t>
-            </w:r>
-            <w:r>
-              <w:rPr>
-                <w:rFonts w:ascii="Arial" w:hAnsi="Arial"/>
-                <w:highlight w:val="yellow"/>
-              </w:rPr>
-              <w:t xml:space="preserve">l’ASP </w:t>
-            </w:r>
-            <w:r>
-              <w:rPr>
-                <w:rFonts w:ascii="Arial" w:hAnsi="Arial"/>
-                <w:highlight w:val="yellow"/>
-              </w:rPr>
-              <w:t>classique</w:t>
-            </w:r>
-            <w:r>
-              <w:rPr>
-                <w:rFonts w:ascii="Arial" w:hAnsi="Arial"/>
-                <w:highlight w:val="yellow"/>
-              </w:rPr>
-              <w:t xml:space="preserve"> et le site web en </w:t>
-            </w:r>
-            <w:r>
-              <w:rPr>
-                <w:rFonts w:ascii="Arial" w:hAnsi="Arial"/>
-                <w:highlight w:val="yellow"/>
-              </w:rPr>
-              <w:t>générale</w:t>
+              <w:t>Aucune.</w:t>
             </w:r>
           </w:p>
         </w:tc>
@@ -676,28 +658,7 @@
                 <w:rFonts w:ascii="Arial" w:hAnsi="Arial"/>
                 <w:highlight w:val="yellow"/>
               </w:rPr>
-              <w:t>Il n’y a pas</w:t>
-            </w:r>
-            <w:r>
-              <w:rPr>
-                <w:rFonts w:ascii="Arial" w:hAnsi="Arial"/>
-                <w:highlight w:val="yellow"/>
-              </w:rPr>
-              <w:t xml:space="preserve"> de documentation sur l’application on doit alors poser des questions sur tout </w:t>
-            </w:r>
-            <w:r>
-              <w:rPr>
-                <w:rFonts w:ascii="Arial" w:hAnsi="Arial"/>
-                <w:highlight w:val="yellow"/>
-              </w:rPr>
-              <w:t>son</w:t>
-            </w:r>
-            <w:r>
-              <w:rPr>
-                <w:rFonts w:ascii="Arial" w:hAnsi="Arial"/>
-                <w:highlight w:val="yellow"/>
-              </w:rPr>
-              <w:t xml:space="preserve"> fonctionnement</w:t>
+              <w:t>Pourquoi faire la compatibilité sur IE 8 si le but est de transposer l’application dans une technologie récente.</w:t>
             </w:r>
           </w:p>
         </w:tc>
@@ -723,14 +684,21 @@
                 <w:rFonts w:ascii="Arial" w:hAnsi="Arial"/>
                 <w:highlight w:val="yellow"/>
               </w:rPr>
-              <w:t>Comprendre le fonctionnement de l’application et comprendre comment ASP fonctionne</w:t>
+              <w:t xml:space="preserve">Rendre mon code compatible pour IE 8 et les autre </w:t>
+            </w:r>
+            <w:r>
+              <w:rPr>
+                <w:rFonts w:ascii="Arial" w:hAnsi="Arial"/>
+                <w:highlight w:val="yellow"/>
+              </w:rPr>
+              <w:t>navigateur</w:t>
             </w:r>
           </w:p>
         </w:tc>
       </w:tr>
       <w:tr>
         <w:trPr>
-          <w:trHeight w:hRule="exact" w:val="1553"/>
+          <w:trHeight w:hRule="exact" w:val="2060"/>
           <w:jc w:val="center"/>
         </w:trPr>
         <w:tc>
@@ -756,7 +724,7 @@
                 <w:rFonts w:ascii="Arial" w:hAnsi="Arial"/>
                 <w:highlight w:val="yellow"/>
               </w:rPr>
-              <w:t>Moi et Danil est en équipe pour refaire l’application Punch pour le montrer au marketing</w:t>
+              <w:t>Ma page de (settings) est fini et j’ai sauvegarder les infos nécessaires dans les cookies pour que la page de (Login) sait dans quelle Compagnie, plant, centre de travail et machine utiliser</w:t>
             </w:r>
           </w:p>
         </w:tc>
@@ -783,42 +751,7 @@
                 <w:rFonts w:ascii="Arial" w:hAnsi="Arial"/>
                 <w:highlight w:val="yellow"/>
               </w:rPr>
-              <w:t xml:space="preserve">Je </w:t>
-            </w:r>
-            <w:r>
-              <w:rPr>
-                <w:rFonts w:ascii="Arial" w:hAnsi="Arial"/>
-                <w:highlight w:val="yellow"/>
-              </w:rPr>
-              <w:t xml:space="preserve">m’approprie les langages </w:t>
-            </w:r>
-            <w:r>
-              <w:rPr>
-                <w:rFonts w:ascii="Arial" w:hAnsi="Arial"/>
-                <w:highlight w:val="yellow"/>
-              </w:rPr>
-              <w:t>ASP</w:t>
-            </w:r>
-            <w:r>
-              <w:rPr>
-                <w:rFonts w:ascii="Arial" w:hAnsi="Arial"/>
-                <w:highlight w:val="yellow"/>
-              </w:rPr>
-              <w:t xml:space="preserve"> Classique</w:t>
-            </w:r>
-            <w:r>
-              <w:rPr>
-                <w:rFonts w:ascii="Arial" w:hAnsi="Arial"/>
-                <w:highlight w:val="yellow"/>
-              </w:rPr>
-              <w:t xml:space="preserve"> et </w:t>
-            </w:r>
-            <w:r>
-              <w:rPr>
-                <w:rFonts w:ascii="Arial" w:hAnsi="Arial"/>
-                <w:highlight w:val="yellow"/>
-              </w:rPr>
-              <w:t>JS qui fonctionne ensemble pour faire un site web</w:t>
+              <w:t>Je peux garder les anciennes fonctions et les adapter pour avoir la requête a la base de donne</w:t>
             </w:r>
           </w:p>
         </w:tc>
@@ -845,7 +778,7 @@
                 <w:rFonts w:ascii="Arial" w:hAnsi="Arial"/>
                 <w:highlight w:val="yellow"/>
               </w:rPr>
-              <w:t>Savoir quel parti de code fait quoi</w:t>
+              <w:t xml:space="preserve">Comment briser les « combos » pour prendre l’information et l’afficher correctement </w:t>
             </w:r>
           </w:p>
         </w:tc>
@@ -871,7 +804,7 @@
                 <w:rFonts w:ascii="Arial" w:hAnsi="Arial"/>
                 <w:highlight w:val="yellow"/>
               </w:rPr>
-              <w:t>Les variables n’ont pas toujours de nom appropries et clair pour les taches</w:t>
+              <w:t>Aucun.</w:t>
             </w:r>
           </w:p>
         </w:tc>
@@ -898,14 +831,39 @@
                 <w:rFonts w:ascii="Arial" w:hAnsi="Arial"/>
                 <w:highlight w:val="yellow"/>
               </w:rPr>
-              <w:t>Aucun</w:t>
-            </w:r>
+              <w:t xml:space="preserve">Aider </w:t>
+            </w:r>
+            <w:proofErr w:type="spellStart"/>
+            <w:r>
+              <w:rPr>
+                <w:rFonts w:ascii="Arial" w:hAnsi="Arial"/>
+                <w:highlight w:val="yellow"/>
+              </w:rPr>
+              <w:t>Danil</w:t>
+            </w:r>
+            <w:proofErr w:type="spellEnd"/>
+            <w:r>
+              <w:rPr>
+                <w:rFonts w:ascii="Arial" w:hAnsi="Arial"/>
+                <w:highlight w:val="yellow"/>
+              </w:rPr>
+              <w:t xml:space="preserve"> sur la page login/</w:t>
+            </w:r>
+            <w:proofErr w:type="spellStart"/>
+            <w:r>
+              <w:rPr>
+                <w:rFonts w:ascii="Arial" w:hAnsi="Arial"/>
+                <w:highlight w:val="yellow"/>
+              </w:rPr>
+              <w:t>dashboard</w:t>
+            </w:r>
+            <w:proofErr w:type="spellEnd"/>
           </w:p>
         </w:tc>
       </w:tr>
       <w:tr>
         <w:trPr>
-          <w:trHeight w:hRule="exact" w:val="1104"/>
+          <w:trHeight w:hRule="exact" w:val="1682"/>
           <w:jc w:val="center"/>
         </w:trPr>
         <w:tc>
@@ -931,8 +889,33 @@
                 <w:rFonts w:ascii="Arial" w:hAnsi="Arial"/>
                 <w:highlight w:val="yellow"/>
               </w:rPr>
-              <w:t>Séparation du travail et début de la reconstruction du punch. Pour ma part je fait le coter settings qui est ;la première page</w:t>
-            </w:r>
+              <w:t xml:space="preserve">Faire le UI </w:t>
+            </w:r>
+            <w:proofErr w:type="spellStart"/>
+            <w:r>
+              <w:rPr>
+                <w:rFonts w:ascii="Arial" w:hAnsi="Arial"/>
+                <w:highlight w:val="yellow"/>
+              </w:rPr>
+              <w:t>darkmode</w:t>
+            </w:r>
+            <w:proofErr w:type="spellEnd"/>
+            <w:r>
+              <w:rPr>
+                <w:rFonts w:ascii="Arial" w:hAnsi="Arial"/>
+                <w:highlight w:val="yellow"/>
+              </w:rPr>
+              <w:t xml:space="preserve"> pour la page Login vu qu’on ne travail pas avec un </w:t>
+            </w:r>
+            <w:proofErr w:type="spellStart"/>
+            <w:r>
+              <w:rPr>
+                <w:rFonts w:ascii="Arial" w:hAnsi="Arial"/>
+                <w:highlight w:val="yellow"/>
+              </w:rPr>
+              <w:t>framework</w:t>
+            </w:r>
+            <w:proofErr w:type="spellEnd"/>
           </w:p>
         </w:tc>
         <w:tc>
@@ -958,7 +941,7 @@
                 <w:rFonts w:ascii="Arial" w:hAnsi="Arial"/>
                 <w:highlight w:val="yellow"/>
               </w:rPr>
-              <w:t>J’ai découvert que je ne suis pas si pire pour être lead</w:t>
+              <w:t>Aucun.</w:t>
             </w:r>
           </w:p>
         </w:tc>
@@ -985,7 +968,46 @@
                 <w:rFonts w:ascii="Arial" w:hAnsi="Arial"/>
                 <w:highlight w:val="yellow"/>
               </w:rPr>
-              <w:t>Il n’y a pas d’api mais que des procédures stocker sur Oracle</w:t>
+              <w:t xml:space="preserve">Faire un </w:t>
+            </w:r>
+            <w:proofErr w:type="spellStart"/>
+            <w:r>
+              <w:rPr>
+                <w:rFonts w:ascii="Arial" w:hAnsi="Arial"/>
+                <w:highlight w:val="yellow"/>
+              </w:rPr>
+              <w:t>darkmode</w:t>
+            </w:r>
+            <w:proofErr w:type="spellEnd"/>
+            <w:r>
+              <w:rPr>
+                <w:rFonts w:ascii="Arial" w:hAnsi="Arial"/>
+                <w:highlight w:val="yellow"/>
+              </w:rPr>
+              <w:t xml:space="preserve"> qui marche pour l’application au complet </w:t>
+            </w:r>
+            <w:r>
+              <w:rPr>
+                <w:rFonts w:ascii="Arial" w:hAnsi="Arial"/>
+                <w:highlight w:val="yellow"/>
+              </w:rPr>
+              <w:t xml:space="preserve">sans avoir 2 </w:t>
+            </w:r>
+            <w:proofErr w:type="spellStart"/>
+            <w:r>
+              <w:rPr>
+                <w:rFonts w:ascii="Arial" w:hAnsi="Arial"/>
+                <w:highlight w:val="yellow"/>
+              </w:rPr>
+              <w:t>css</w:t>
+            </w:r>
+            <w:proofErr w:type="spellEnd"/>
+            <w:r>
+              <w:rPr>
+                <w:rFonts w:ascii="Arial" w:hAnsi="Arial"/>
+                <w:highlight w:val="yellow"/>
+              </w:rPr>
+              <w:t xml:space="preserve"> pour chaque page</w:t>
             </w:r>
           </w:p>
         </w:tc>
@@ -1013,7 +1035,7 @@
                 <w:rFonts w:ascii="Arial" w:hAnsi="Arial"/>
                 <w:highlight w:val="yellow"/>
               </w:rPr>
-              <w:t>Aucun.</w:t>
+              <w:t>Finalement, on peut faire l’application seulement pour les nouveaux navigateurs tant que le backend garde la logique établie</w:t>
             </w:r>
           </w:p>
         </w:tc>
@@ -1040,28 +1062,7 @@
                 <w:rFonts w:ascii="Arial" w:hAnsi="Arial"/>
                 <w:highlight w:val="yellow"/>
               </w:rPr>
-              <w:t>Réfléchir a comment rendre les procédure</w:t>
-            </w:r>
-            <w:r>
-              <w:rPr>
-                <w:rFonts w:ascii="Arial" w:hAnsi="Arial"/>
-                <w:highlight w:val="yellow"/>
-              </w:rPr>
-              <w:t xml:space="preserve"> </w:t>
-            </w:r>
-            <w:r>
-              <w:rPr>
-                <w:rFonts w:ascii="Arial" w:hAnsi="Arial"/>
-                <w:highlight w:val="yellow"/>
-              </w:rPr>
-              <w:t>ASP classique plus facile à accéder vu qu’ils fonctionnent avec combo</w:t>
-            </w:r>
-            <w:r>
-              <w:rPr>
-                <w:rFonts w:ascii="Arial" w:hAnsi="Arial"/>
-                <w:highlight w:val="yellow"/>
-              </w:rPr>
-              <w:t xml:space="preserve"> </w:t>
+              <w:t>Faire de la fonctionnalité sur la page login comme utiliser le scanner pour sélection un employé, un id de travail et afficher le menu selon qui il sont</w:t>
             </w:r>
           </w:p>
         </w:tc>
@@ -1094,7 +1095,7 @@
                 <w:rFonts w:asciiTheme="minorBidi" w:hAnsiTheme="minorBidi" w:cstheme="minorBidi"/>
                 <w:highlight w:val="yellow"/>
               </w:rPr>
-              <w:t>Faire un design du punch comme l’image photoshop et finition du JS qui agis comme back-end pour aller chercher les donnes</w:t>
+              <w:t>Utilisation d’un scanner qui est activer ou désactiver en fonction d’un bouton et qui scan un code barre qui est automatiquement saisie pour la bonne option</w:t>
             </w:r>
           </w:p>
           <w:p>
@@ -1129,7 +1130,7 @@
                 <w:rFonts w:asciiTheme="minorBidi" w:hAnsiTheme="minorBidi" w:cstheme="minorBidi"/>
                 <w:highlight w:val="yellow"/>
               </w:rPr>
-              <w:t>Faire du design sans framework ce qui donne la faciliter et retirer les combos et transformer les data query pour avoir des donnes lisibles</w:t>
+              <w:t>Comprendre le fonctionnement des barres codes pour être distinct les uns les autres et les attribuer à la bonne action en fonction de celui-ci</w:t>
             </w:r>
           </w:p>
           <w:p>
@@ -1164,7 +1165,23 @@
                 <w:rFonts w:asciiTheme="minorBidi" w:hAnsiTheme="minorBidi" w:cstheme="minorBidi"/>
                 <w:highlight w:val="yellow"/>
               </w:rPr>
-              <w:t>Comprendre de ou viens les donnes et comment l’application faire pour communiquer au DB</w:t>
+              <w:t xml:space="preserve">Comment avoir un </w:t>
+            </w:r>
+            <w:proofErr w:type="spellStart"/>
+            <w:r>
+              <w:rPr>
+                <w:rFonts w:asciiTheme="minorBidi" w:hAnsiTheme="minorBidi" w:cstheme="minorBidi"/>
+                <w:highlight w:val="yellow"/>
+              </w:rPr>
+              <w:t>read</w:t>
+            </w:r>
+            <w:proofErr w:type="spellEnd"/>
+            <w:r>
+              <w:rPr>
+                <w:rFonts w:asciiTheme="minorBidi" w:hAnsiTheme="minorBidi" w:cstheme="minorBidi"/>
+                <w:highlight w:val="yellow"/>
+              </w:rPr>
+              <w:t xml:space="preserve"> buffer pour la saisie du scanner</w:t>
             </w:r>
           </w:p>
         </w:tc>
@@ -1191,7 +1208,7 @@
                 <w:rFonts w:asciiTheme="minorBidi" w:hAnsiTheme="minorBidi" w:cstheme="minorBidi"/>
                 <w:highlight w:val="yellow"/>
               </w:rPr>
-              <w:t>La technologie utiliser est vraiment nouveau pour moi et veille elle est pour IE 8</w:t>
+              <w:t>On va avoir besoin de plus de design pour les prochaines pages vu qu’on a presque fini la page de login(main).</w:t>
             </w:r>
           </w:p>
         </w:tc>
@@ -1218,7 +1235,7 @@
                 <w:rFonts w:asciiTheme="minorBidi" w:hAnsiTheme="minorBidi" w:cstheme="minorBidi"/>
                 <w:highlight w:val="yellow"/>
               </w:rPr>
-              <w:t>Continuer de travailler en équipe pour faire rejoindre nos deux pages</w:t>
+              <w:t>Finir les fonctions du scanneur pour ensuite embarque sur le page des boutons menus qui sont unique à chaque rôle des utilisateur</w:t>
             </w:r>
           </w:p>
         </w:tc>
@@ -1324,8 +1341,16 @@
               <w:rPr>
                 <w:b/>
               </w:rPr>
-              <w:t>Michel Genereux</w:t>
-            </w:r>
+              <w:t xml:space="preserve">Michel </w:t>
+            </w:r>
+            <w:proofErr w:type="spellStart"/>
+            <w:r>
+              <w:rPr>
+                <w:b/>
+              </w:rPr>
+              <w:t>Genereux</w:t>
+            </w:r>
+            <w:proofErr w:type="spellEnd"/>
           </w:p>
         </w:tc>
       </w:tr>

</xml_diff>